<commit_message>
Update vocabulary: 2026-06-28 batch 2
</commit_message>
<xml_diff>
--- a/English_Learning_Notes.docx
+++ b/English_Learning_Notes.docx
@@ -2280,6 +2280,138 @@
         <w:t>複習安排：stage 0；下次複習 2026-06-29；難度 new</w:t>
       </w:r>
     </w:p>
+    <w:p>
+      <w:pPr>
+        <w:pStyle w:val="Heading2"/>
+      </w:pPr>
+      <w:r>
+        <w:t>8. provoke</w:t>
+      </w:r>
+    </w:p>
+    <w:p>
+      <w:pPr/>
+      <w:r>
+        <w:t>中文意思：激怒、挑釁</w:t>
+      </w:r>
+    </w:p>
+    <w:p>
+      <w:pPr/>
+      <w:r>
+        <w:t>類型：verb</w:t>
+      </w:r>
+    </w:p>
+    <w:p>
+      <w:pPr/>
+      <w:r>
+        <w:t>例句：Don't provoke him any further; he is already on the verge of losing his temper.</w:t>
+      </w:r>
+    </w:p>
+    <w:p>
+      <w:pPr/>
+      <w:r>
+        <w:t>用法補充：雖然意思是「激怒」或「挑釁」，但我們常用在叫人別去惹事生非、或是別再惡化局面。日常或電影常見用法如 "Don't provoke him/her"（別惹他），或 "unprovoked attack"（莫名其妙、毫無預警的攻擊/批評）。</w:t>
+      </w:r>
+    </w:p>
+    <w:p>
+      <w:pPr/>
+      <w:r>
+        <w:t>標籤：daily, conversation, verb</w:t>
+      </w:r>
+    </w:p>
+    <w:p>
+      <w:pPr/>
+      <w:r>
+        <w:t>複習安排：stage 0；下次複習 2026-06-29；難度 new</w:t>
+      </w:r>
+    </w:p>
+    <w:p>
+      <w:pPr>
+        <w:pStyle w:val="Heading2"/>
+      </w:pPr>
+      <w:r>
+        <w:t>9. alligator</w:t>
+      </w:r>
+    </w:p>
+    <w:p>
+      <w:pPr/>
+      <w:r>
+        <w:t>中文意思：短吻鱷（常用於告別語）</w:t>
+      </w:r>
+    </w:p>
+    <w:p>
+      <w:pPr/>
+      <w:r>
+        <w:t>類型：noun</w:t>
+      </w:r>
+    </w:p>
+    <w:p>
+      <w:pPr/>
+      <w:r>
+        <w:t>例句："See you later, alligator!" she waved goodbye, and he replied, "In a while, crocodile!"</w:t>
+      </w:r>
+    </w:p>
+    <w:p>
+      <w:pPr/>
+      <w:r>
+        <w:t>用法補充：除了指動物本身之外，在日常對話中文化上最常用的是押韻告別語："See you later, alligator!"，而標準、必須知道的回應是 "In a while, crocodile!"。這是和朋友道別時一種趣味、輕鬆的說法。</w:t>
+      </w:r>
+    </w:p>
+    <w:p>
+      <w:pPr/>
+      <w:r>
+        <w:t>標籤：daily, conversation, spoken expression</w:t>
+      </w:r>
+    </w:p>
+    <w:p>
+      <w:pPr/>
+      <w:r>
+        <w:t>複習安排：stage 0；下次複習 2026-06-29；難度 new</w:t>
+      </w:r>
+    </w:p>
+    <w:p>
+      <w:pPr>
+        <w:pStyle w:val="Heading2"/>
+      </w:pPr>
+      <w:r>
+        <w:t>10. stairwell</w:t>
+      </w:r>
+    </w:p>
+    <w:p>
+      <w:pPr/>
+      <w:r>
+        <w:t>中文意思：樓梯間、樓梯井</w:t>
+      </w:r>
+    </w:p>
+    <w:p>
+      <w:pPr/>
+      <w:r>
+        <w:t>類型：noun</w:t>
+      </w:r>
+    </w:p>
+    <w:p>
+      <w:pPr/>
+      <w:r>
+        <w:t>例句：Please head toward the emergency stairwell if the alarm goes off.</w:t>
+      </w:r>
+    </w:p>
+    <w:p>
+      <w:pPr/>
+      <w:r>
+        <w:t>用法補充：指包含整座樓梯的垂直封閉空間。在國外校園、公寓或大樓中是非常普遍的安全基礎單字。</w:t>
+      </w:r>
+    </w:p>
+    <w:p>
+      <w:pPr/>
+      <w:r>
+        <w:t>標籤：daily, conversation, noun</w:t>
+      </w:r>
+    </w:p>
+    <w:p>
+      <w:pPr/>
+      <w:r>
+        <w:t>複習安排：stage 0；下次複習 2026-06-29；難度 new</w:t>
+      </w:r>
+    </w:p>
     <w:sectPr>
       <w:pgSz w:w="12240" w:h="15840"/>
       <w:pgMar w:top="1440" w:right="1440" w:bottom="1440" w:left="1440" w:header="708" w:footer="708" w:gutter="0"/>

</xml_diff>

<commit_message>
Update vocabulary: 2026-07-05 batch 2
</commit_message>
<xml_diff>
--- a/English_Learning_Notes.docx
+++ b/English_Learning_Notes.docx
@@ -2916,7 +2916,7 @@
     <w:p>
       <w:pPr/>
       <w:r>
-        <w:t>本日新增 25 筆英文詞彙與片語。例句以自然、實用、可複習為主，並已加入 spaced repetition 複習資訊。</w:t>
+        <w:t>本日新增 29 筆英文詞彙與片語。例句以自然、實用、可複習為主，並已加入 spaced repetition 複習資訊。</w:t>
       </w:r>
     </w:p>
     <w:p>
@@ -4077,6 +4077,182 @@
       <w:pPr/>
       <w:r>
         <w:t>標籤：academic, writing, noun, collocation</w:t>
+      </w:r>
+    </w:p>
+    <w:p>
+      <w:pPr/>
+      <w:r>
+        <w:t>複習安排：stage 0；下次複習 2026-07-06；難度 new</w:t>
+      </w:r>
+    </w:p>
+    <w:p>
+      <w:pPr>
+        <w:pStyle w:val="Heading2"/>
+      </w:pPr>
+      <w:r>
+        <w:t>26. compliance</w:t>
+      </w:r>
+    </w:p>
+    <w:p>
+      <w:pPr/>
+      <w:r>
+        <w:t>中文意思：服從、順從；遵守、合規</w:t>
+      </w:r>
+    </w:p>
+    <w:p>
+      <w:pPr/>
+      <w:r>
+        <w:t>類型：noun</w:t>
+      </w:r>
+    </w:p>
+    <w:p>
+      <w:pPr/>
+      <w:r>
+        <w:t>例句：The more parents demand compliance, the more children dig in their heels.</w:t>
+      </w:r>
+    </w:p>
+    <w:p>
+      <w:pPr/>
+      <w:r>
+        <w:t>用法補充：指遵守法律、規則或要求。在日常教育中，意指服從管教。</w:t>
+      </w:r>
+    </w:p>
+    <w:p>
+      <w:pPr/>
+      <w:r>
+        <w:t>標籤：daily, academic, noun</w:t>
+      </w:r>
+    </w:p>
+    <w:p>
+      <w:pPr/>
+      <w:r>
+        <w:t>複習安排：stage 0；下次複習 2026-07-06；難度 new</w:t>
+      </w:r>
+    </w:p>
+    <w:p>
+      <w:pPr>
+        <w:pStyle w:val="Heading2"/>
+      </w:pPr>
+      <w:r>
+        <w:t>27. dig in one's heels</w:t>
+      </w:r>
+    </w:p>
+    <w:p>
+      <w:pPr/>
+      <w:r>
+        <w:t>中文意思：堅持己見、固執己見、不肯讓步</w:t>
+      </w:r>
+    </w:p>
+    <w:p>
+      <w:pPr/>
+      <w:r>
+        <w:t>類型：idiom</w:t>
+      </w:r>
+    </w:p>
+    <w:p>
+      <w:pPr/>
+      <w:r>
+        <w:t>例句：The more parents demand compliance, the more children dig in their heels.</w:t>
+      </w:r>
+    </w:p>
+    <w:p>
+      <w:pPr/>
+      <w:r>
+        <w:t>用法補充：字面意思是將腳後跟深埋入土中，比喻在受到反對或壓力時，態度變得更加堅定頑固，絕不妥協。</w:t>
+      </w:r>
+    </w:p>
+    <w:p>
+      <w:pPr/>
+      <w:r>
+        <w:t>標籤：daily, conversation, idiom, useful-expression</w:t>
+      </w:r>
+    </w:p>
+    <w:p>
+      <w:pPr/>
+      <w:r>
+        <w:t>複習安排：stage 0；下次複習 2026-07-06；難度 new</w:t>
+      </w:r>
+    </w:p>
+    <w:p>
+      <w:pPr>
+        <w:pStyle w:val="Heading2"/>
+      </w:pPr>
+      <w:r>
+        <w:t>28. rebellious</w:t>
+      </w:r>
+    </w:p>
+    <w:p>
+      <w:pPr/>
+      <w:r>
+        <w:t>中文意思：叛逆的、造反的、難以控制的</w:t>
+      </w:r>
+    </w:p>
+    <w:p>
+      <w:pPr/>
+      <w:r>
+        <w:t>類型：adjective</w:t>
+      </w:r>
+    </w:p>
+    <w:p>
+      <w:pPr/>
+      <w:r>
+        <w:t>例句：Excessive pressure can make children more rebellious.</w:t>
+      </w:r>
+    </w:p>
+    <w:p>
+      <w:pPr/>
+      <w:r>
+        <w:t>用法補充：形容不服從管教或反抗權威的行為，常用於形容青少年（rebellious teenagers）。</w:t>
+      </w:r>
+    </w:p>
+    <w:p>
+      <w:pPr/>
+      <w:r>
+        <w:t>標籤：daily, academic, adjective</w:t>
+      </w:r>
+    </w:p>
+    <w:p>
+      <w:pPr/>
+      <w:r>
+        <w:t>複習安排：stage 0；下次複習 2026-07-06；難度 new</w:t>
+      </w:r>
+    </w:p>
+    <w:p>
+      <w:pPr>
+        <w:pStyle w:val="Heading2"/>
+      </w:pPr>
+      <w:r>
+        <w:t>29. backfire</w:t>
+      </w:r>
+    </w:p>
+    <w:p>
+      <w:pPr/>
+      <w:r>
+        <w:t>中文意思：事與願違、適得其反</w:t>
+      </w:r>
+    </w:p>
+    <w:p>
+      <w:pPr/>
+      <w:r>
+        <w:t>類型：verb</w:t>
+      </w:r>
+    </w:p>
+    <w:p>
+      <w:pPr/>
+      <w:r>
+        <w:t>例句：Pushing children too hard often backfires; they end up doing the exact opposite.</w:t>
+      </w:r>
+    </w:p>
+    <w:p>
+      <w:pPr/>
+      <w:r>
+        <w:t>用法補充：形容某個計畫或行動產生了與預期相反的、糟糕的結果。</w:t>
+      </w:r>
+    </w:p>
+    <w:p>
+      <w:pPr/>
+      <w:r>
+        <w:t>標籤：daily, academic, verb</w:t>
       </w:r>
     </w:p>
     <w:p>

</xml_diff>